<commit_message>
docs(examples): regenerate numbering.docx after rename
</commit_message>
<xml_diff>
--- a/examples/word/numbering.docx
+++ b/examples/word/numbering.docx
@@ -378,6 +378,119 @@
           <w:sz w:val="28"/>
         </w:rPr>
         <w:t xml:space="preserve">6. Style-borne numbering (paragraph inherits via pStyle)</w:t>
+      </w:r>
+    </w:p>
+    <w:p>
+      <w:pPr>
+        <w:pStyle w:val="ShowcaseListItem"/>
+      </w:pPr>
+      <w:r>
+        <w:rPr/>
+        <w:t xml:space="preserve">Inherits numbering through style</w:t>
+      </w:r>
+    </w:p>
+    <w:p>
+      <w:pPr>
+        <w:pStyle w:val="ShowcaseListItem"/>
+      </w:pPr>
+      <w:r>
+        <w:rPr/>
+        <w:t xml:space="preserve">Second item, also via style</w:t>
+      </w:r>
+    </w:p>
+    <w:p>
+      <w:pPr>
+        <w:pStyle w:val="ShowcaseListItem"/>
+      </w:pPr>
+      <w:r>
+        <w:rPr/>
+        <w:t xml:space="preserve">Third item — note: paragraphs themselves have no numPr</w:t>
+      </w:r>
+    </w:p>
+    <w:p>
+      <w:pPr/>
+      <w:r>
+        <w:rPr/>
+        <w:t xml:space="preserve"/>
+      </w:r>
+    </w:p>
+    <w:p>
+      <w:pPr>
+        <w:spacing w:before="240" w:after="120"/>
+      </w:pPr>
+      <w:r>
+        <w:rPr>
+          <w:b/>
+          <w:sz w:val="28"/>
+        </w:rPr>
+        <w:t xml:space="preserve">7. Modify abstractNum after creation</w:t>
+      </w:r>
+    </w:p>
+    <w:p>
+      <w:pPr>
+        <w:numPr>
+          <w:ilvl w:val="0"/>
+          <w:numId w:val="8"/>
+        </w:numPr>
+      </w:pPr>
+      <w:r>
+        <w:rPr/>
+        <w:t xml:space="preserve">Outer step</w:t>
+      </w:r>
+    </w:p>
+    <w:p>
+      <w:pPr>
+        <w:numPr>
+          <w:ilvl w:val="1"/>
+          <w:numId w:val="8"/>
+        </w:numPr>
+      </w:pPr>
+      <w:r>
+        <w:rPr/>
+        <w:t xml:space="preserve">Mid step</w:t>
+      </w:r>
+    </w:p>
+    <w:p>
+      <w:pPr>
+        <w:numPr>
+          <w:ilvl w:val="2"/>
+          <w:numId w:val="8"/>
+        </w:numPr>
+      </w:pPr>
+      <w:r>
+        <w:rPr/>
+        <w:t xml:space="preserve">Inner step</w:t>
+      </w:r>
+    </w:p>
+    <w:p>
+      <w:pPr>
+        <w:numPr>
+          <w:ilvl w:val="3"/>
+          <w:numId w:val="8"/>
+        </w:numPr>
+      </w:pPr>
+      <w:r>
+        <w:rPr/>
+        <w:t xml:space="preserve">Deepest step (modified after creation)</w:t>
+      </w:r>
+    </w:p>
+    <w:p>
+      <w:pPr/>
+      <w:r>
+        <w:rPr/>
+        <w:t xml:space="preserve"/>
+      </w:r>
+    </w:p>
+    <w:p>
+      <w:pPr>
+        <w:jc w:val="center"/>
+      </w:pPr>
+      <w:r>
+        <w:rPr>
+          <w:i/>
+          <w:color w:val="666666"/>
+        </w:rPr>
+        <w:t xml:space="preserve">End of showcase. Open in Word/Google Docs to see all numbering rendered.</w:t>
       </w:r>
     </w:p>
     <w:sectPr>
@@ -437,11 +550,16 @@
     <w:lvl w:ilvl="3">
       <w:start w:val="1"/>
       <w:numFmt w:val="decimal"/>
-      <w:lvlText w:val="%4."/>
+      <w:lvlText w:val="Step %4 ⇒"/>
       <w:lvlJc w:val="left"/>
       <w:pPr>
         <w:ind w:left="2880" w:hanging="360"/>
       </w:pPr>
+      <w:rPr>
+        <w:b/>
+        <w:color w:val="70AD47"/>
+        <w:sz w:val="24"/>
+      </w:rPr>
     </w:lvl>
     <w:lvl w:ilvl="4">
       <w:start w:val="1"/>
@@ -795,6 +913,18 @@
       <w:startOverride w:val="1"/>
     </w:lvlOverride>
   </w:num>
+  <w:num w:numId="7">
+    <w:abstractNumId w:val="300"/>
+    <w:lvlOverride w:ilvl="0">
+      <w:startOverride w:val="1"/>
+    </w:lvlOverride>
+  </w:num>
+  <w:num w:numId="8">
+    <w:abstractNumId w:val="100"/>
+    <w:lvlOverride w:ilvl="0">
+      <w:startOverride w:val="1"/>
+    </w:lvlOverride>
+  </w:num>
 </w:numbering>
 </file>
 
@@ -815,6 +945,16 @@
     <w:qFormat/>
     <w:pPr>
       <w:spacing w:after="0" w:line="259" w:lineRule="auto"/>
+    </w:pPr>
+  </w:style>
+  <w:style w:type="paragraph" w:styleId="ShowcaseListItem" w:customStyle="true">
+    <w:name w:val="Showcase List Item"/>
+    <w:basedOn w:val="Normal"/>
+    <w:pPr>
+      <w:numPr>
+        <w:ilvl w:val="0"/>
+        <w:numId w:val="7"/>
+      </w:numPr>
     </w:pPr>
   </w:style>
 </w:styles>

</xml_diff>